<commit_message>
Refresh site from updated resume
</commit_message>
<xml_diff>
--- a/Sarayu_Kotha_Resume.docx
+++ b/Sarayu_Kotha_Resume.docx
@@ -2349,13 +2349,27 @@
           <w:b/>
           <w:sz w:val="21"/>
         </w:rPr>
-        <w:t>Captain— Senior Rowing Crew</w:t>
-      </w:r>
-      <w:r>
-        <w:rPr>
-          <w:color w:val="005F5F"/>
-        </w:rPr>
-        <w:t xml:space="preserve">  |  </w:t>
+        <w:t xml:space="preserve">Coxswain </w:t>
+      </w:r>
+      <w:r>
+        <w:rPr>
+          <w:b/>
+          <w:sz w:val="21"/>
+        </w:rPr>
+        <w:t>Captain</w:t>
+      </w:r>
+      <w:r>
+        <w:rPr>
+          <w:b/>
+          <w:sz w:val="21"/>
+        </w:rPr>
+        <w:t xml:space="preserve"> </w:t>
+      </w:r>
+      <w:r>
+        <w:rPr>
+          <w:color w:val="005F5F"/>
+        </w:rPr>
+        <w:t xml:space="preserve">| </w:t>
       </w:r>
       <w:r>
         <w:rPr>
@@ -2463,31 +2477,14 @@
         <w:t xml:space="preserve"> </w:t>
       </w:r>
       <w:r>
-        <w:t xml:space="preserve">Responsible for race tactics, crew safety, and real-time decision-making for eight experienced rowers; build detailed race plans by studying each rower's profile and reading course conditions, then adapt strategy under competitive pressure. </w:t>
-      </w:r>
-    </w:p>
-    <w:p>
-      <w:pPr>
-        <w:ind w:left="554"/>
-      </w:pPr>
-      <w:r>
-        <w:rPr>
-          <w:rFonts w:ascii="Cambria Math" w:eastAsia="Cambria Math" w:hAnsi="Cambria Math" w:cs="Cambria Math"/>
-          <w:color w:val="005F5F"/>
-          <w:sz w:val="18"/>
-        </w:rPr>
-        <w:t>▸</w:t>
-      </w:r>
-      <w:r>
-        <w:rPr>
-          <w:rFonts w:ascii="Arial" w:eastAsia="Arial" w:hAnsi="Arial" w:cs="Arial"/>
-          <w:color w:val="005F5F"/>
-          <w:sz w:val="18"/>
-        </w:rPr>
-        <w:t xml:space="preserve"> </w:t>
-      </w:r>
-      <w:r>
-        <w:t xml:space="preserve">Lead pre-session briefings and post-session debriefs, earning trust from athletes who have significantly more time on the water than I do. </w:t>
+        <w:tab/>
+        <w:t>B</w:t>
+      </w:r>
+      <w:r>
+        <w:t>uild detailed race plans by studying each rower's profile and reading course conditions, then adapt strategy under competitive pressure</w:t>
+      </w:r>
+      <w:r>
+        <w:t xml:space="preserve">. </w:t>
       </w:r>
     </w:p>
     <w:p>
@@ -2512,19 +2509,10 @@
         <w:t xml:space="preserve"> </w:t>
       </w:r>
       <w:r>
-        <w:t xml:space="preserve"> Managing the dual demands of captaincy and a full academic load has sharpened how I prioritise, perform under pressure, and recover quickly when things don't go to plan. </w:t>
-      </w:r>
-    </w:p>
-    <w:p>
-      <w:pPr>
-        <w:spacing w:after="120" w:line="259" w:lineRule="auto"/>
-        <w:ind w:left="0" w:firstLine="0"/>
-      </w:pPr>
-      <w:r>
-        <w:rPr>
-          <w:color w:val="000000"/>
-        </w:rPr>
-        <w:t xml:space="preserve"> </w:t>
+        <w:t>Managing</w:t>
+      </w:r>
+      <w:r>
+        <w:t xml:space="preserve"> the dual demands of captaincy and a full academic load has sharpened how I prioritise, perform under pressure, and recover quickly when things don't go to plan. </w:t>
       </w:r>
     </w:p>
     <w:p>
@@ -2540,13 +2528,28 @@
           <w:b/>
           <w:sz w:val="21"/>
         </w:rPr>
-        <w:t>Peer Wellbeing Mentor &amp; Head of Form</w:t>
-      </w:r>
-      <w:r>
-        <w:rPr>
-          <w:color w:val="005F5F"/>
-        </w:rPr>
-        <w:t xml:space="preserve">  |  </w:t>
+        <w:t xml:space="preserve">Peer Wellbeing Mentor &amp; Head of </w:t>
+      </w:r>
+      <w:proofErr w:type="gramStart"/>
+      <w:r>
+        <w:rPr>
+          <w:b/>
+          <w:sz w:val="21"/>
+        </w:rPr>
+        <w:t>Form</w:t>
+      </w:r>
+      <w:r>
+        <w:rPr>
+          <w:color w:val="005F5F"/>
+        </w:rPr>
+        <w:t xml:space="preserve">  |</w:t>
+      </w:r>
+      <w:proofErr w:type="gramEnd"/>
+      <w:r>
+        <w:rPr>
+          <w:color w:val="005F5F"/>
+        </w:rPr>
+        <w:t xml:space="preserve">  </w:t>
       </w:r>
       <w:r>
         <w:rPr>
@@ -2584,7 +2587,6 @@
           <w:color w:val="005F5F"/>
           <w:sz w:val="18"/>
         </w:rPr>
-        <w:lastRenderedPageBreak/>
         <w:t>▸</w:t>
       </w:r>
       <w:r>
@@ -2604,30 +2606,11 @@
         </w:rPr>
         <w:t xml:space="preserve"> </w:t>
       </w:r>
-    </w:p>
-    <w:p>
-      <w:pPr>
-        <w:spacing w:after="51"/>
-        <w:ind w:left="266" w:firstLine="0"/>
-      </w:pPr>
-      <w:r>
-        <w:rPr>
-          <w:rFonts w:ascii="Cambria Math" w:eastAsia="Cambria Math" w:hAnsi="Cambria Math" w:cs="Cambria Math"/>
-          <w:color w:val="005F5F"/>
-          <w:sz w:val="18"/>
-        </w:rPr>
-        <w:t>▸</w:t>
-      </w:r>
-      <w:r>
-        <w:rPr>
-          <w:rFonts w:ascii="Arial" w:eastAsia="Arial" w:hAnsi="Arial" w:cs="Arial"/>
-          <w:color w:val="005F5F"/>
-          <w:sz w:val="18"/>
-        </w:rPr>
-        <w:t xml:space="preserve"> </w:t>
-      </w:r>
-      <w:r>
-        <w:t>Took responsibility for the welfare and cohesion of a form group, demonstrating initiative and quiet leadership.</w:t>
+      <w:r>
+        <w:t xml:space="preserve"> </w:t>
+      </w:r>
+      <w:r>
+        <w:t>Took responsibility for the welfare and cohesion of a form, demonstrating initiative and quiet leadership.</w:t>
       </w:r>
       <w:r>
         <w:rPr>
@@ -2647,27 +2630,33 @@
         </w:rPr>
         <w:t xml:space="preserve"> </w:t>
       </w:r>
-    </w:p>
-    <w:p>
-      <w:pPr>
-        <w:tabs>
-          <w:tab w:val="center" w:pos="8912"/>
-        </w:tabs>
-        <w:spacing w:after="14" w:line="259" w:lineRule="auto"/>
-        <w:ind w:left="-15" w:firstLine="0"/>
-      </w:pPr>
       <w:r>
         <w:rPr>
           <w:b/>
           <w:sz w:val="21"/>
         </w:rPr>
-        <w:t>Principal Flautist</w:t>
-      </w:r>
-      <w:r>
-        <w:rPr>
-          <w:color w:val="005F5F"/>
-        </w:rPr>
-        <w:t xml:space="preserve">  |  </w:t>
+        <w:t xml:space="preserve">Principal </w:t>
+      </w:r>
+      <w:proofErr w:type="gramStart"/>
+      <w:r>
+        <w:rPr>
+          <w:b/>
+          <w:sz w:val="21"/>
+        </w:rPr>
+        <w:t>Flautist</w:t>
+      </w:r>
+      <w:r>
+        <w:rPr>
+          <w:color w:val="005F5F"/>
+        </w:rPr>
+        <w:t xml:space="preserve">  |</w:t>
+      </w:r>
+      <w:proofErr w:type="gramEnd"/>
+      <w:r>
+        <w:rPr>
+          <w:color w:val="005F5F"/>
+        </w:rPr>
+        <w:t xml:space="preserve">  </w:t>
       </w:r>
       <w:r>
         <w:rPr>

</xml_diff>